<commit_message>
Insert Section 6.1.9 verbatim and re-frame RFI-126020-010
Section 6.1.9 directs use of the existing cover lifting lugs to lift
EA-2107A, B and C rather than installation of new lugs, so the RFI is
re-framed around that requirement and the placeholder is removed.

Raises three conflicts between the clause and drawing EA2102D-049 Rev 0.2:
Note 10 records lugs on the EA-2102D channel installed on EA-2107B only
while the clause states EA-2107A and B; Note 10 requires engineering
re-evaluation before a cover is transferred to EA-2107C; and the 43,042 lb
combined vertical capacity in the clause is the sum of two 21,521 lb
ratings that Note 7 qualifies as in-plane only.

Trims the question and recommended solution so the form fits Page 1 of 1,
and drops a trailing empty paragraph that produced a blank second page.

Co-Authored-By: Claude Opus 5 <noreply@anthropic.com>
Claude-Session: https://claude.ai/code/session_01FRKcXJeEVhp99TA37hSnDC
</commit_message>
<xml_diff>
--- a/RFI/RFI126020010__TLE_Cover_Lifting_Lugs.docx
+++ b/RFI/RFI126020010__TLE_Cover_Lifting_Lugs.docx
@@ -899,7 +899,7 @@
                 <w:sz w:val="18"/>
                 <w:szCs w:val="18"/>
               </w:rPr>
-              <w:t xml:space="preserve">Section 6.1.9 of the Construction Work Package specifies a lifting lug configuration for the TLE channel covers. Section 6.1.9 states:</w:t>
+              <w:t xml:space="preserve">Section 6.1.9 of the Construction Work Package requires the existing channel cover lifting lugs to be used to lift TLEs EA-2107A, B and C. Section 6.1.9 states:</w:t>
             </w:r>
             <w:proofErr w:type="gramStart"/>
             <w:proofErr w:type="gramEnd"/>
@@ -942,7 +942,7 @@
                 <w:i/>
                 <w:iCs/>
               </w:rPr>
-              <w:t xml:space="preserve">«INSERT VERBATIM TEXT OF SCOPE SECTION 6.1.9 HERE PRIOR TO ISSUE»</w:t>
+              <w:t xml:space="preserve">“Use the existing lifting lug on the top of each TLE’s channel cover to lift existing TLEs tag # EA-2107A, B &amp; C from heater BA-2107. Refer to drawing number EA2102D-049. The cover lifting lugs have a combined vertical lifting capacity of 43,042 lbs. These cover lifting lugs were installed on EA-2107A &amp; B in 2022. One of these covers can be used to replace the cover on EA-2107C after EA-2107A&amp;B have been removed.”</w:t>
             </w:r>
             <w:proofErr w:type="gramStart"/>
             <w:proofErr w:type="gramEnd"/>
@@ -980,7 +980,7 @@
                 <w:sz w:val="18"/>
                 <w:szCs w:val="18"/>
               </w:rPr>
-              <w:t xml:space="preserve">Field review of the existing TLEs found no channel covers fitted with lifting lugs in the specified configuration.</w:t>
+              <w:t xml:space="preserve">Field review of the existing TLEs found no channel covers fitted with lifting lugs to EA2102D-049.</w:t>
             </w:r>
             <w:proofErr w:type="gramStart"/>
             <w:proofErr w:type="gramEnd"/>
@@ -1018,7 +1018,7 @@
                 <w:sz w:val="18"/>
                 <w:szCs w:val="18"/>
               </w:rPr>
-              <w:t xml:space="preserve">The only lug arrangement identified on an issued drawing is EA2102D-049 Rev 0.2 (Work Package, page 92), which shows two lugs welded to the EA-2102D channel cover, each rated 21,521 lb in-plane only. Note 10 of that drawing states:</w:t>
+              <w:t xml:space="preserve">Drawing EA2102D-049 Rev 0.2 records a single installation. Note 10 states:</w:t>
             </w:r>
             <w:proofErr w:type="gramStart"/>
             <w:proofErr w:type="gramEnd"/>
@@ -1099,7 +1099,45 @@
                 <w:sz w:val="18"/>
                 <w:szCs w:val="18"/>
               </w:rPr>
-              <w:t xml:space="preserve">Installation to this detail also requires 400°F (204°C) preheat, post weld heat treatment at 1250°F (675°C) for 5 hr 45 min, liquid penetrant examination of the first and final weld pass, and a 91 PSIG hydrotest of the channel (Notes 4, 5, 8 and 9).</w:t>
+              <w:t xml:space="preserve">The drawing therefore accounts for lugs on EA-2107B only, not on EA-2107A as stated in Section 6.1.9, and Note 10 appears to require engineering re-evaluation before a lugged cover is transferred to EA-2107C.</w:t>
+            </w:r>
+            <w:proofErr w:type="gramStart"/>
+            <w:proofErr w:type="gramEnd"/>
+            <w:proofErr w:type="spellStart"/>
+            <w:proofErr w:type="spellEnd"/>
+            <w:proofErr w:type="gramStart"/>
+            <w:proofErr w:type="gramEnd"/>
+            <w:proofErr w:type="gramStart"/>
+            <w:proofErr w:type="gramEnd"/>
+            <w:proofErr w:type="spellStart"/>
+            <w:proofErr w:type="gramStart"/>
+            <w:proofErr w:type="spellEnd"/>
+            <w:proofErr w:type="gramEnd"/>
+            <w:proofErr w:type="spellStart"/>
+            <w:proofErr w:type="spellEnd"/>
+            <w:proofErr w:type="spellStart"/>
+            <w:proofErr w:type="spellEnd"/>
+          </w:p>
+          <w:p>
+            <w:pPr>
+              <w:spacing w:before="120"/>
+              <w:rPr>
+                <w:rStyle w:val="PlaceholderText"/>
+                <w:rFonts w:ascii="Arial" w:hAnsi="Arial" w:cs="Arial"/>
+                <w:bCs/>
+                <w:color w:val="auto"/>
+                <w:sz w:val="18"/>
+                <w:szCs w:val="18"/>
+              </w:rPr>
+            </w:pPr>
+            <w:r>
+              <w:rPr>
+                <w:rFonts w:ascii="Arial" w:hAnsi="Arial" w:cs="Arial"/>
+                <w:bCs/>
+                <w:sz w:val="18"/>
+                <w:szCs w:val="18"/>
+              </w:rPr>
+              <w:t xml:space="preserve">Note 7 of the same drawing rates each lug at 21,521 lb in-plane only. The 43,042 lb figure in Section 6.1.9 is the sum of the two in-plane ratings and is stated as a vertical lifting capacity.</w:t>
             </w:r>
             <w:proofErr w:type="gramStart"/>
             <w:proofErr w:type="gramEnd"/>
@@ -1206,7 +1244,7 @@
                     <w:sz w:val="18"/>
                     <w:szCs w:val="18"/>
                   </w:rPr>
-                  <w:t xml:space="preserve">Please confirm whether TLE channel covers fitted with lifting lugs in the Section 6.1.9 configuration exist and, if so, issue the applicable drawings. If they do not, please confirm the required lug configuration and the affected TLE tags, and advise whether design and installation of new lugs is to be treated as a change to scope.</w:t>
+                  <w:t xml:space="preserve">Please confirm the location and installation records of the existing cover lifting lugs and issue the applicable drawings. If lugs to EA2102D-049 are not installed on EA-2107A, B and C, please advise the lifting method to be used and whether design and installation of new lugs is a change to scope. Please also confirm the sling arrangement required to keep each lug loaded in-plane, and that engineering re-evaluation under Note 10 will be provided for reuse of a cover on EA-2107C.</w:t>
                 </w:r>
                 <w:proofErr w:type="gramStart"/>
                 <w:proofErr w:type="gramEnd"/>
@@ -2959,16 +2997,6 @@
         </w:tc>
       </w:tr>
     </w:tbl>
-    <w:p>
-      <w:pPr>
-        <w:rPr>
-          <w:rFonts w:ascii="Arial" w:hAnsi="Arial" w:cs="Arial"/>
-          <w:color w:val="000000" w:themeColor="text1"/>
-          <w:sz w:val="18"/>
-          <w:szCs w:val="18"/>
-        </w:rPr>
-      </w:pPr>
-    </w:p>
     <w:sectPr>
       <w:headerReference w:type="default" r:id="rId11"/>
       <w:pgSz w:w="12240" w:h="15840"/>

</xml_diff>

<commit_message>
Align field review statement with PM wording and append attachments
Restores the qualifier the PM used: the field review found no channel
covers with lifting lugs installed in the configuration specified by
Section 6.1.9, rather than no covers fitted with lifting lugs at all.
The unqualified wording overclaims and is rebutted by any lug on site.

Corrects the originator date to August 25, 2026 to match the header, and
removes two empty paragraphs that produced a blank page between the
appended scope excerpt and drawing. The package is now three pages.

Retains the supplied discipline, originator title, urgency and the
rotation applied to the drawing.

Co-Authored-By: Claude Opus 5 <noreply@anthropic.com>
Claude-Session: https://claude.ai/code/session_01FRKcXJeEVhp99TA37hSnDC
</commit_message>
<xml_diff>
--- a/RFI/RFI126020010__TLE_Cover_Lifting_Lugs.docx
+++ b/RFI/RFI126020010__TLE_Cover_Lifting_Lugs.docx
@@ -1,6 +1,6 @@
 
 <file path=word/document.xml><?xml version="1.0" encoding="utf-8"?>
-<w:document xmlns:mc="http://schemas.openxmlformats.org/markup-compatibility/2006" xmlns:r="http://schemas.openxmlformats.org/officeDocument/2006/relationships" xmlns:w="http://schemas.openxmlformats.org/wordprocessingml/2006/main" xmlns:w14="http://schemas.microsoft.com/office/word/2010/wordml" mc:Ignorable="w14 w15 w16se w16cid w16 w16cex w16sdtdh w16sdtfl w16du wp14">
+<w:document xmlns:a="http://schemas.openxmlformats.org/drawingml/2006/main" xmlns:mc="http://schemas.openxmlformats.org/markup-compatibility/2006" xmlns:pic="http://schemas.openxmlformats.org/drawingml/2006/picture" xmlns:r="http://schemas.openxmlformats.org/officeDocument/2006/relationships" xmlns:w="http://schemas.openxmlformats.org/wordprocessingml/2006/main" xmlns:w14="http://schemas.microsoft.com/office/word/2010/wordml" xmlns:wp="http://schemas.openxmlformats.org/drawingml/2006/wordprocessingDrawing" xmlns:wp14="http://schemas.microsoft.com/office/word/2010/wordprocessingDrawing" mc:Ignorable="w14 w15 w16se w16cid w16 w16cex w16sdtdh w16sdtfl w16du wp14">
   <w:body>
     <w:tbl>
       <w:tblPr>
@@ -307,7 +307,27 @@
                     <w:sz w:val="18"/>
                     <w:szCs w:val="18"/>
                   </w:rPr>
-                  <w:t xml:space="preserve">August 24, 2026</w:t>
+                  <w:t>August 2</w:t>
+                </w:r>
+                <w:r>
+                  <w:rPr>
+                    <w:rFonts w:ascii="Arial" w:hAnsi="Arial" w:cs="Arial"/>
+                    <w:bCs/>
+                    <w:color w:val="000000" w:themeColor="text1"/>
+                    <w:sz w:val="18"/>
+                    <w:szCs w:val="18"/>
+                  </w:rPr>
+                  <w:t>5</w:t>
+                </w:r>
+                <w:r>
+                  <w:rPr>
+                    <w:rFonts w:ascii="Arial" w:hAnsi="Arial" w:cs="Arial"/>
+                    <w:bCs/>
+                    <w:color w:val="000000" w:themeColor="text1"/>
+                    <w:sz w:val="18"/>
+                    <w:szCs w:val="18"/>
+                  </w:rPr>
+                  <w:t>, 2026</w:t>
                 </w:r>
               </w:p>
             </w:tc>
@@ -375,7 +395,7 @@
                     <w:sz w:val="18"/>
                     <w:szCs w:val="18"/>
                   </w:rPr>
-                  <w:t xml:space="preserve">Mechanical</w:t>
+                  <w:t>Structural</w:t>
                 </w:r>
               </w:p>
             </w:tc>
@@ -618,10 +638,8 @@
                     <w:sz w:val="18"/>
                     <w:szCs w:val="18"/>
                   </w:rPr>
-                  <w:t xml:space="preserve">TLE Channel Cover Lifting Lugs</w:t>
+                  <w:t>TLE Channel Cover Lifting Lugs</w:t>
                 </w:r>
-                <w:proofErr w:type="spellStart"/>
-                <w:proofErr w:type="spellEnd"/>
               </w:p>
             </w:tc>
           </w:sdtContent>
@@ -734,24 +752,8 @@
                     <w:sz w:val="18"/>
                     <w:szCs w:val="18"/>
                   </w:rPr>
-                  <w:t xml:space="preserve">26766 - CWP-G02 Rev 0.1 - 2021489 – IFC, Section 6.1.9</w:t>
+                  <w:t>26766 - CWP-G02 Rev 0.1 - 2021489 – IFC, Section 6.1.9</w:t>
                 </w:r>
-                <w:proofErr w:type="gramStart"/>
-                <w:proofErr w:type="gramEnd"/>
-                <w:proofErr w:type="spellStart"/>
-                <w:proofErr w:type="spellEnd"/>
-                <w:proofErr w:type="gramStart"/>
-                <w:proofErr w:type="gramEnd"/>
-                <w:proofErr w:type="gramStart"/>
-                <w:proofErr w:type="gramEnd"/>
-                <w:proofErr w:type="spellStart"/>
-                <w:proofErr w:type="gramStart"/>
-                <w:proofErr w:type="spellEnd"/>
-                <w:proofErr w:type="gramEnd"/>
-                <w:proofErr w:type="spellStart"/>
-                <w:proofErr w:type="spellEnd"/>
-                <w:proofErr w:type="spellStart"/>
-                <w:proofErr w:type="spellEnd"/>
               </w:p>
               <w:p>
                 <w:pPr>
@@ -772,24 +774,8 @@
                     <w:sz w:val="18"/>
                     <w:szCs w:val="18"/>
                   </w:rPr>
-                  <w:t xml:space="preserve">EA2102D-049 Rev 0.2, “EA-2102D New Lifting Lug Installation” (Work Package, page 92)</w:t>
+                  <w:t>EA2102D-049 Rev 0.2, “EA-2102D New Lifting Lug Installation” (Work Package, page 92)</w:t>
                 </w:r>
-                <w:proofErr w:type="gramStart"/>
-                <w:proofErr w:type="gramEnd"/>
-                <w:proofErr w:type="spellStart"/>
-                <w:proofErr w:type="spellEnd"/>
-                <w:proofErr w:type="gramStart"/>
-                <w:proofErr w:type="gramEnd"/>
-                <w:proofErr w:type="gramStart"/>
-                <w:proofErr w:type="gramEnd"/>
-                <w:proofErr w:type="spellStart"/>
-                <w:proofErr w:type="gramStart"/>
-                <w:proofErr w:type="spellEnd"/>
-                <w:proofErr w:type="gramEnd"/>
-                <w:proofErr w:type="spellStart"/>
-                <w:proofErr w:type="spellEnd"/>
-                <w:proofErr w:type="spellStart"/>
-                <w:proofErr w:type="spellEnd"/>
               </w:p>
             </w:tc>
           </w:sdtContent>
@@ -899,24 +885,8 @@
                 <w:sz w:val="18"/>
                 <w:szCs w:val="18"/>
               </w:rPr>
-              <w:t xml:space="preserve">Section 6.1.9 of the Construction Work Package requires the existing channel cover lifting lugs to be used to lift TLEs EA-2107A, B and C. Section 6.1.9 states:</w:t>
-            </w:r>
-            <w:proofErr w:type="gramStart"/>
-            <w:proofErr w:type="gramEnd"/>
-            <w:proofErr w:type="spellStart"/>
-            <w:proofErr w:type="spellEnd"/>
-            <w:proofErr w:type="gramStart"/>
-            <w:proofErr w:type="gramEnd"/>
-            <w:proofErr w:type="gramStart"/>
-            <w:proofErr w:type="gramEnd"/>
-            <w:proofErr w:type="spellStart"/>
-            <w:proofErr w:type="gramStart"/>
-            <w:proofErr w:type="spellEnd"/>
-            <w:proofErr w:type="gramEnd"/>
-            <w:proofErr w:type="spellStart"/>
-            <w:proofErr w:type="spellEnd"/>
-            <w:proofErr w:type="spellStart"/>
-            <w:proofErr w:type="spellEnd"/>
+              <w:t>Section 6.1.9 of the Construction Work Package requires the existing channel cover lifting lugs to be used to lift TLEs EA-2107A, B and C. Section 6.1.9 states:</w:t>
+            </w:r>
           </w:p>
           <w:p>
             <w:pPr>
@@ -926,40 +896,24 @@
                 <w:rStyle w:val="PlaceholderText"/>
                 <w:rFonts w:ascii="Arial" w:hAnsi="Arial" w:cs="Arial"/>
                 <w:bCs/>
-                <w:color w:val="auto"/>
-                <w:sz w:val="18"/>
-                <w:szCs w:val="18"/>
                 <w:i/>
                 <w:iCs/>
+                <w:color w:val="auto"/>
+                <w:sz w:val="18"/>
+                <w:szCs w:val="18"/>
               </w:rPr>
             </w:pPr>
             <w:r>
               <w:rPr>
                 <w:rFonts w:ascii="Arial" w:hAnsi="Arial" w:cs="Arial"/>
                 <w:bCs/>
-                <w:sz w:val="18"/>
-                <w:szCs w:val="18"/>
                 <w:i/>
                 <w:iCs/>
-              </w:rPr>
-              <w:t xml:space="preserve">“Use the existing lifting lug on the top of each TLE’s channel cover to lift existing TLEs tag # EA-2107A, B &amp; C from heater BA-2107. Refer to drawing number EA2102D-049. The cover lifting lugs have a combined vertical lifting capacity of 43,042 lbs. These cover lifting lugs were installed on EA-2107A &amp; B in 2022. One of these covers can be used to replace the cover on EA-2107C after EA-2107A&amp;B have been removed.”</w:t>
-            </w:r>
-            <w:proofErr w:type="gramStart"/>
-            <w:proofErr w:type="gramEnd"/>
-            <w:proofErr w:type="spellStart"/>
-            <w:proofErr w:type="spellEnd"/>
-            <w:proofErr w:type="gramStart"/>
-            <w:proofErr w:type="gramEnd"/>
-            <w:proofErr w:type="gramStart"/>
-            <w:proofErr w:type="gramEnd"/>
-            <w:proofErr w:type="spellStart"/>
-            <w:proofErr w:type="gramStart"/>
-            <w:proofErr w:type="spellEnd"/>
-            <w:proofErr w:type="gramEnd"/>
-            <w:proofErr w:type="spellStart"/>
-            <w:proofErr w:type="spellEnd"/>
-            <w:proofErr w:type="spellStart"/>
-            <w:proofErr w:type="spellEnd"/>
+                <w:sz w:val="18"/>
+                <w:szCs w:val="18"/>
+              </w:rPr>
+              <w:t>“Use the existing lifting lug on the top of each TLE’s channel cover to lift existing TLEs tag # EA-2107A, B &amp; C from heater BA-2107. Refer to drawing number EA2102D-049. The cover lifting lugs have a combined vertical lifting capacity of 43,042 lbs. These cover lifting lugs were installed on EA-2107A &amp; B in 2022. One of these covers can be used to replace the cover on EA-2107C after EA-2107A&amp;B have been removed.”</w:t>
+            </w:r>
           </w:p>
           <w:p>
             <w:pPr>
@@ -980,24 +934,8 @@
                 <w:sz w:val="18"/>
                 <w:szCs w:val="18"/>
               </w:rPr>
-              <w:t xml:space="preserve">Field review of the existing TLEs found no channel covers fitted with lifting lugs to EA2102D-049.</w:t>
-            </w:r>
-            <w:proofErr w:type="gramStart"/>
-            <w:proofErr w:type="gramEnd"/>
-            <w:proofErr w:type="spellStart"/>
-            <w:proofErr w:type="spellEnd"/>
-            <w:proofErr w:type="gramStart"/>
-            <w:proofErr w:type="gramEnd"/>
-            <w:proofErr w:type="gramStart"/>
-            <w:proofErr w:type="gramEnd"/>
-            <w:proofErr w:type="spellStart"/>
-            <w:proofErr w:type="gramStart"/>
-            <w:proofErr w:type="spellEnd"/>
-            <w:proofErr w:type="gramEnd"/>
-            <w:proofErr w:type="spellStart"/>
-            <w:proofErr w:type="spellEnd"/>
-            <w:proofErr w:type="spellStart"/>
-            <w:proofErr w:type="spellEnd"/>
+              <w:t xml:space="preserve">Field review of the existing TLEs found no channel covers with lifting lugs installed in the configuration specified by Section 6.1.9.</w:t>
+            </w:r>
           </w:p>
           <w:p>
             <w:pPr>
@@ -1018,24 +956,8 @@
                 <w:sz w:val="18"/>
                 <w:szCs w:val="18"/>
               </w:rPr>
-              <w:t xml:space="preserve">Drawing EA2102D-049 Rev 0.2 records a single installation. Note 10 states:</w:t>
-            </w:r>
-            <w:proofErr w:type="gramStart"/>
-            <w:proofErr w:type="gramEnd"/>
-            <w:proofErr w:type="spellStart"/>
-            <w:proofErr w:type="spellEnd"/>
-            <w:proofErr w:type="gramStart"/>
-            <w:proofErr w:type="gramEnd"/>
-            <w:proofErr w:type="gramStart"/>
-            <w:proofErr w:type="gramEnd"/>
-            <w:proofErr w:type="spellStart"/>
-            <w:proofErr w:type="gramStart"/>
-            <w:proofErr w:type="spellEnd"/>
-            <w:proofErr w:type="gramEnd"/>
-            <w:proofErr w:type="spellStart"/>
-            <w:proofErr w:type="spellEnd"/>
-            <w:proofErr w:type="spellStart"/>
-            <w:proofErr w:type="spellEnd"/>
+              <w:t>Drawing EA2102D-049 Rev 0.2 records a single installation. Note 10 states:</w:t>
+            </w:r>
           </w:p>
           <w:p>
             <w:pPr>
@@ -1045,40 +967,24 @@
                 <w:rStyle w:val="PlaceholderText"/>
                 <w:rFonts w:ascii="Arial" w:hAnsi="Arial" w:cs="Arial"/>
                 <w:bCs/>
-                <w:color w:val="auto"/>
-                <w:sz w:val="18"/>
-                <w:szCs w:val="18"/>
                 <w:i/>
                 <w:iCs/>
+                <w:color w:val="auto"/>
+                <w:sz w:val="18"/>
+                <w:szCs w:val="18"/>
               </w:rPr>
             </w:pPr>
             <w:r>
               <w:rPr>
                 <w:rFonts w:ascii="Arial" w:hAnsi="Arial" w:cs="Arial"/>
                 <w:bCs/>
-                <w:sz w:val="18"/>
-                <w:szCs w:val="18"/>
                 <w:i/>
                 <w:iCs/>
-              </w:rPr>
-              <w:t xml:space="preserve">“This change is implemented in April 2022, when EA-2102D channel is installed on EA-2107B TLE tube section. These lifting lugs have been designed for this configuration only. Any future change must be re-evaluated by engineering.”</w:t>
-            </w:r>
-            <w:proofErr w:type="gramStart"/>
-            <w:proofErr w:type="gramEnd"/>
-            <w:proofErr w:type="spellStart"/>
-            <w:proofErr w:type="spellEnd"/>
-            <w:proofErr w:type="gramStart"/>
-            <w:proofErr w:type="gramEnd"/>
-            <w:proofErr w:type="gramStart"/>
-            <w:proofErr w:type="gramEnd"/>
-            <w:proofErr w:type="spellStart"/>
-            <w:proofErr w:type="gramStart"/>
-            <w:proofErr w:type="spellEnd"/>
-            <w:proofErr w:type="gramEnd"/>
-            <w:proofErr w:type="spellStart"/>
-            <w:proofErr w:type="spellEnd"/>
-            <w:proofErr w:type="spellStart"/>
-            <w:proofErr w:type="spellEnd"/>
+                <w:sz w:val="18"/>
+                <w:szCs w:val="18"/>
+              </w:rPr>
+              <w:t>“This change is implemented in April 2022, when EA-2102D channel is installed on EA-2107B TLE tube section. These lifting lugs have been designed for this configuration only. Any future change must be re-evaluated by engineering.”</w:t>
+            </w:r>
           </w:p>
           <w:p>
             <w:pPr>
@@ -1099,24 +1005,28 @@
                 <w:sz w:val="18"/>
                 <w:szCs w:val="18"/>
               </w:rPr>
-              <w:t xml:space="preserve">The drawing therefore accounts for lugs on EA-2107B only, not on EA-2107A as stated in Section 6.1.9, and Note 10 appears to require engineering re-evaluation before a lugged cover is transferred to EA-2107C.</w:t>
+              <w:t xml:space="preserve">The drawing therefore accounts for lugs on EA-2107B only, not on EA-2107A as stated in Section </w:t>
             </w:r>
             <w:proofErr w:type="gramStart"/>
+            <w:r>
+              <w:rPr>
+                <w:rFonts w:ascii="Arial" w:hAnsi="Arial" w:cs="Arial"/>
+                <w:bCs/>
+                <w:sz w:val="18"/>
+                <w:szCs w:val="18"/>
+              </w:rPr>
+              <w:t>6.1.9, and</w:t>
+            </w:r>
             <w:proofErr w:type="gramEnd"/>
-            <w:proofErr w:type="spellStart"/>
-            <w:proofErr w:type="spellEnd"/>
-            <w:proofErr w:type="gramStart"/>
-            <w:proofErr w:type="gramEnd"/>
-            <w:proofErr w:type="gramStart"/>
-            <w:proofErr w:type="gramEnd"/>
-            <w:proofErr w:type="spellStart"/>
-            <w:proofErr w:type="gramStart"/>
-            <w:proofErr w:type="spellEnd"/>
-            <w:proofErr w:type="gramEnd"/>
-            <w:proofErr w:type="spellStart"/>
-            <w:proofErr w:type="spellEnd"/>
-            <w:proofErr w:type="spellStart"/>
-            <w:proofErr w:type="spellEnd"/>
+            <w:r>
+              <w:rPr>
+                <w:rFonts w:ascii="Arial" w:hAnsi="Arial" w:cs="Arial"/>
+                <w:bCs/>
+                <w:sz w:val="18"/>
+                <w:szCs w:val="18"/>
+              </w:rPr>
+              <w:t xml:space="preserve"> Note 10 appears to require engineering re-evaluation before a lugged cover is transferred to EA-2107C.</w:t>
+            </w:r>
           </w:p>
           <w:p>
             <w:pPr>
@@ -1137,24 +1047,28 @@
                 <w:sz w:val="18"/>
                 <w:szCs w:val="18"/>
               </w:rPr>
-              <w:t xml:space="preserve">Note 7 of the same drawing rates each lug at 21,521 lb in-plane only. The 43,042 lb figure in Section 6.1.9 is the sum of the two in-plane ratings and is stated as a vertical lifting capacity.</w:t>
+              <w:t xml:space="preserve">Note 7 of the same drawing rates each lug at 21,521 lb in-plane only. The 43,042 lb </w:t>
             </w:r>
             <w:proofErr w:type="gramStart"/>
+            <w:r>
+              <w:rPr>
+                <w:rFonts w:ascii="Arial" w:hAnsi="Arial" w:cs="Arial"/>
+                <w:bCs/>
+                <w:sz w:val="18"/>
+                <w:szCs w:val="18"/>
+              </w:rPr>
+              <w:t>figure</w:t>
+            </w:r>
             <w:proofErr w:type="gramEnd"/>
-            <w:proofErr w:type="spellStart"/>
-            <w:proofErr w:type="spellEnd"/>
-            <w:proofErr w:type="gramStart"/>
-            <w:proofErr w:type="gramEnd"/>
-            <w:proofErr w:type="gramStart"/>
-            <w:proofErr w:type="gramEnd"/>
-            <w:proofErr w:type="spellStart"/>
-            <w:proofErr w:type="gramStart"/>
-            <w:proofErr w:type="spellEnd"/>
-            <w:proofErr w:type="gramEnd"/>
-            <w:proofErr w:type="spellStart"/>
-            <w:proofErr w:type="spellEnd"/>
-            <w:proofErr w:type="spellStart"/>
-            <w:proofErr w:type="spellEnd"/>
+            <w:r>
+              <w:rPr>
+                <w:rFonts w:ascii="Arial" w:hAnsi="Arial" w:cs="Arial"/>
+                <w:bCs/>
+                <w:sz w:val="18"/>
+                <w:szCs w:val="18"/>
+              </w:rPr>
+              <w:t xml:space="preserve"> in Section 6.1.9 is the sum of the two in-plane ratings and is stated as a vertical lifting capacity.</w:t>
+            </w:r>
           </w:p>
         </w:tc>
       </w:tr>
@@ -1244,24 +1158,8 @@
                     <w:sz w:val="18"/>
                     <w:szCs w:val="18"/>
                   </w:rPr>
-                  <w:t xml:space="preserve">Please confirm the location and installation records of the existing cover lifting lugs and issue the applicable drawings. If lugs to EA2102D-049 are not installed on EA-2107A, B and C, please advise the lifting method to be used and whether design and installation of new lugs is a change to scope. Please also confirm the sling arrangement required to keep each lug loaded in-plane, and that engineering re-evaluation under Note 10 will be provided for reuse of a cover on EA-2107C.</w:t>
+                  <w:t>Please confirm the location and installation records of the existing cover lifting lugs and issue the applicable drawings. If lugs to EA2102D-049 are not installed on EA-2107A, B and C, please advise the lifting method to be used and whether design and installation of new lugs is a change to scope. Please also confirm the sling arrangement required to keep each lug loaded in-plane, and that engineering re-evaluation under Note 10 will be provided for reuse of a cover on EA-2107C.</w:t>
                 </w:r>
-                <w:proofErr w:type="gramStart"/>
-                <w:proofErr w:type="gramEnd"/>
-                <w:proofErr w:type="spellStart"/>
-                <w:proofErr w:type="spellEnd"/>
-                <w:proofErr w:type="gramStart"/>
-                <w:proofErr w:type="gramEnd"/>
-                <w:proofErr w:type="gramStart"/>
-                <w:proofErr w:type="gramEnd"/>
-                <w:proofErr w:type="spellStart"/>
-                <w:proofErr w:type="gramStart"/>
-                <w:proofErr w:type="spellEnd"/>
-                <w:proofErr w:type="gramEnd"/>
-                <w:proofErr w:type="spellStart"/>
-                <w:proofErr w:type="spellEnd"/>
-                <w:proofErr w:type="spellStart"/>
-                <w:proofErr w:type="spellEnd"/>
               </w:p>
             </w:tc>
           </w:sdtContent>
@@ -1673,6 +1571,7 @@
           <w:p>
             <w:pPr>
               <w:spacing w:before="40"/>
+              <w:jc w:val="center"/>
               <w:rPr>
                 <w:rFonts w:ascii="Arial" w:hAnsi="Arial" w:cs="Arial"/>
                 <w:color w:val="000000" w:themeColor="text1"/>
@@ -1680,6 +1579,15 @@
                 <w:szCs w:val="18"/>
               </w:rPr>
             </w:pPr>
+            <w:r>
+              <w:rPr>
+                <w:rFonts w:ascii="Arial" w:hAnsi="Arial" w:cs="Arial"/>
+                <w:color w:val="000000" w:themeColor="text1"/>
+                <w:sz w:val="18"/>
+                <w:szCs w:val="18"/>
+              </w:rPr>
+              <w:t>PC</w:t>
+            </w:r>
           </w:p>
         </w:tc>
         <w:tc>
@@ -1734,7 +1642,7 @@
                 <w:sz w:val="18"/>
                 <w:szCs w:val="18"/>
               </w:rPr>
-              <w:t xml:space="preserve">August 24, 2026</w:t>
+              <w:t xml:space="preserve">August 25, 2026</w:t>
             </w:r>
           </w:p>
         </w:tc>
@@ -2081,7 +1989,7 @@
       </w:tr>
       <w:tr>
         <w:trPr>
-          <w:trHeight w:val="2255"/>
+          <w:trHeight w:val="1853"/>
         </w:trPr>
         <w:tc>
           <w:tcPr>
@@ -2103,107 +2011,6 @@
                 <w:szCs w:val="18"/>
               </w:rPr>
             </w:pPr>
-            <w:r>
-              <w:rPr>
-                <w:rFonts w:ascii="Arial" w:hAnsi="Arial" w:cs="Arial"/>
-                <w:color w:val="000000" w:themeColor="text1"/>
-                <w:sz w:val="18"/>
-                <w:szCs w:val="18"/>
-              </w:rPr>
-              <w:fldChar w:fldCharType="begin">
-                <w:ffData>
-                  <w:name w:val="Text417"/>
-                  <w:enabled/>
-                  <w:calcOnExit w:val="0"/>
-                  <w:textInput/>
-                </w:ffData>
-              </w:fldChar>
-            </w:r>
-            <w:r>
-              <w:rPr>
-                <w:rFonts w:ascii="Arial" w:hAnsi="Arial" w:cs="Arial"/>
-                <w:color w:val="000000" w:themeColor="text1"/>
-                <w:sz w:val="18"/>
-                <w:szCs w:val="18"/>
-              </w:rPr>
-              <w:instrText xml:space="preserve"> FORMTEXT </w:instrText>
-            </w:r>
-            <w:r>
-              <w:rPr>
-                <w:rFonts w:ascii="Arial" w:hAnsi="Arial" w:cs="Arial"/>
-                <w:color w:val="000000" w:themeColor="text1"/>
-                <w:sz w:val="18"/>
-                <w:szCs w:val="18"/>
-              </w:rPr>
-            </w:r>
-            <w:r>
-              <w:rPr>
-                <w:rFonts w:ascii="Arial" w:hAnsi="Arial" w:cs="Arial"/>
-                <w:color w:val="000000" w:themeColor="text1"/>
-                <w:sz w:val="18"/>
-                <w:szCs w:val="18"/>
-              </w:rPr>
-              <w:fldChar w:fldCharType="separate"/>
-            </w:r>
-            <w:r>
-              <w:rPr>
-                <w:rFonts w:ascii="Arial" w:hAnsi="Arial" w:cs="Arial"/>
-                <w:noProof/>
-                <w:color w:val="000000" w:themeColor="text1"/>
-                <w:sz w:val="18"/>
-                <w:szCs w:val="18"/>
-              </w:rPr>
-              <w:t> </w:t>
-            </w:r>
-            <w:r>
-              <w:rPr>
-                <w:rFonts w:ascii="Arial" w:hAnsi="Arial" w:cs="Arial"/>
-                <w:noProof/>
-                <w:color w:val="000000" w:themeColor="text1"/>
-                <w:sz w:val="18"/>
-                <w:szCs w:val="18"/>
-              </w:rPr>
-              <w:t> </w:t>
-            </w:r>
-            <w:r>
-              <w:rPr>
-                <w:rFonts w:ascii="Arial" w:hAnsi="Arial" w:cs="Arial"/>
-                <w:noProof/>
-                <w:color w:val="000000" w:themeColor="text1"/>
-                <w:sz w:val="18"/>
-                <w:szCs w:val="18"/>
-              </w:rPr>
-              <w:t> </w:t>
-            </w:r>
-            <w:r>
-              <w:rPr>
-                <w:rFonts w:ascii="Arial" w:hAnsi="Arial" w:cs="Arial"/>
-                <w:noProof/>
-                <w:color w:val="000000" w:themeColor="text1"/>
-                <w:sz w:val="18"/>
-                <w:szCs w:val="18"/>
-              </w:rPr>
-              <w:t> </w:t>
-            </w:r>
-            <w:r>
-              <w:rPr>
-                <w:rFonts w:ascii="Arial" w:hAnsi="Arial" w:cs="Arial"/>
-                <w:noProof/>
-                <w:color w:val="000000" w:themeColor="text1"/>
-                <w:sz w:val="18"/>
-                <w:szCs w:val="18"/>
-              </w:rPr>
-              <w:t> </w:t>
-            </w:r>
-            <w:r>
-              <w:rPr>
-                <w:rFonts w:ascii="Arial" w:hAnsi="Arial" w:cs="Arial"/>
-                <w:color w:val="000000" w:themeColor="text1"/>
-                <w:sz w:val="18"/>
-                <w:szCs w:val="18"/>
-              </w:rPr>
-              <w:fldChar w:fldCharType="end"/>
-            </w:r>
           </w:p>
         </w:tc>
       </w:tr>
@@ -2239,7 +2046,6 @@
                 <w:sz w:val="18"/>
                 <w:szCs w:val="18"/>
               </w:rPr>
-              <w:lastRenderedPageBreak/>
               <w:t>Respondent:</w:t>
             </w:r>
           </w:p>
@@ -2997,8 +2803,94 @@
         </w:tc>
       </w:tr>
     </w:tbl>
+    <w:p>
+      <w:pPr>
+        <w:jc w:val="center"/>
+      </w:pPr>
+      <w:r>
+        <w:lastRenderedPageBreak/>
+        <w:drawing>
+          <wp:inline distT="0" distB="0" distL="0" distR="0" wp14:anchorId="6C0CC172" wp14:editId="422C690A">
+            <wp:extent cx="6438900" cy="8080969"/>
+            <wp:effectExtent l="0" t="0" r="0" b="0"/>
+            <wp:docPr id="1953274445" name="Picture 1"/>
+            <wp:cNvGraphicFramePr>
+              <a:graphicFrameLocks noChangeAspect="1"/>
+            </wp:cNvGraphicFramePr>
+            <a:graphic>
+              <a:graphicData uri="http://schemas.openxmlformats.org/drawingml/2006/picture">
+                <pic:pic>
+                  <pic:nvPicPr>
+                    <pic:cNvPr id="1953274445" name=""/>
+                    <pic:cNvPicPr/>
+                  </pic:nvPicPr>
+                  <pic:blipFill>
+                    <a:blip r:embed="rId11"/>
+                    <a:stretch>
+                      <a:fillRect/>
+                    </a:stretch>
+                  </pic:blipFill>
+                  <pic:spPr>
+                    <a:xfrm>
+                      <a:off x="0" y="0"/>
+                      <a:ext cx="6472610" cy="8123276"/>
+                    </a:xfrm>
+                    <a:prstGeom prst="rect">
+                      <a:avLst/>
+                    </a:prstGeom>
+                  </pic:spPr>
+                </pic:pic>
+              </a:graphicData>
+            </a:graphic>
+          </wp:inline>
+        </w:drawing>
+      </w:r>
+    </w:p>
+    <w:p>
+      <w:pPr>
+        <w:jc w:val="center"/>
+      </w:pPr>
+      <w:r>
+        <w:lastRenderedPageBreak/>
+        <w:drawing>
+          <wp:inline distT="0" distB="0" distL="0" distR="0" wp14:anchorId="18CA8B62" wp14:editId="7FA31154">
+            <wp:extent cx="8770550" cy="5676494"/>
+            <wp:effectExtent l="3810" t="0" r="0" b="0"/>
+            <wp:docPr id="1393050575" name="Picture 1"/>
+            <wp:cNvGraphicFramePr>
+              <a:graphicFrameLocks noChangeAspect="1"/>
+            </wp:cNvGraphicFramePr>
+            <a:graphic>
+              <a:graphicData uri="http://schemas.openxmlformats.org/drawingml/2006/picture">
+                <pic:pic>
+                  <pic:nvPicPr>
+                    <pic:cNvPr id="1393050575" name=""/>
+                    <pic:cNvPicPr/>
+                  </pic:nvPicPr>
+                  <pic:blipFill>
+                    <a:blip r:embed="rId12"/>
+                    <a:stretch>
+                      <a:fillRect/>
+                    </a:stretch>
+                  </pic:blipFill>
+                  <pic:spPr>
+                    <a:xfrm rot="16200000">
+                      <a:off x="0" y="0"/>
+                      <a:ext cx="8796415" cy="5693234"/>
+                    </a:xfrm>
+                    <a:prstGeom prst="rect">
+                      <a:avLst/>
+                    </a:prstGeom>
+                  </pic:spPr>
+                </pic:pic>
+              </a:graphicData>
+            </a:graphic>
+          </wp:inline>
+        </w:drawing>
+      </w:r>
+    </w:p>
     <w:sectPr>
-      <w:headerReference w:type="default" r:id="rId11"/>
+      <w:headerReference w:type="default" r:id="rId13"/>
       <w:pgSz w:w="12240" w:h="15840"/>
       <w:pgMar w:top="1440" w:right="1080" w:bottom="720" w:left="1080" w:header="720" w:footer="720" w:gutter="0"/>
       <w:cols w:space="720"/>
@@ -4871,6 +4763,7 @@
   <w:style w:type="character" w:default="1" w:styleId="DefaultParagraphFont">
     <w:name w:val="Default Paragraph Font"/>
     <w:uiPriority w:val="1"/>
+    <w:semiHidden/>
     <w:unhideWhenUsed/>
   </w:style>
   <w:style w:type="table" w:default="1" w:styleId="TableNormal">
@@ -5375,9 +5268,11 @@
     <w:rsid w:val="009C1F67"/>
     <w:rsid w:val="009F32EA"/>
     <w:rsid w:val="00A264E0"/>
+    <w:rsid w:val="00A8148B"/>
     <w:rsid w:val="00AA6F88"/>
     <w:rsid w:val="00AB6BD7"/>
     <w:rsid w:val="00B76627"/>
+    <w:rsid w:val="00E079FA"/>
     <w:rsid w:val="00E35D87"/>
     <w:rsid w:val="00E62320"/>
     <w:rsid w:val="00EB5F60"/>
@@ -6209,34 +6104,6 @@
 </file>
 
 <file path=customXml/item1.xml><?xml version="1.0" encoding="utf-8"?>
-<b:Sources xmlns:b="http://schemas.openxmlformats.org/officeDocument/2006/bibliography" xmlns="http://schemas.openxmlformats.org/officeDocument/2006/bibliography" SelectedStyle="\APASixthEditionOfficeOnline.xsl" StyleName="APA" Version="6"/>
-</file>
-
-<file path=customXml/item2.xml><?xml version="1.0" encoding="utf-8"?>
-<p:properties xmlns:p="http://schemas.microsoft.com/office/2006/metadata/properties" xmlns:xsi="http://www.w3.org/2001/XMLSchema-instance" xmlns:pc="http://schemas.microsoft.com/office/infopath/2007/PartnerControls">
-  <documentManagement>
-    <RevisionNo_x002e_ xmlns="5ec69448-d8a2-42ff-9be9-60116bcc6e8f" xsi:nil="true"/>
-    <lcf76f155ced4ddcb4097134ff3c332f xmlns="5ec69448-d8a2-42ff-9be9-60116bcc6e8f">
-      <Terms xmlns="http://schemas.microsoft.com/office/infopath/2007/PartnerControls"/>
-    </lcf76f155ced4ddcb4097134ff3c332f>
-    <DocumentStatus xmlns="5ec69448-d8a2-42ff-9be9-60116bcc6e8f" xsi:nil="true"/>
-    <Package xmlns="5ec69448-d8a2-42ff-9be9-60116bcc6e8f" xsi:nil="true"/>
-    <DocumentTitle xmlns="5ec69448-d8a2-42ff-9be9-60116bcc6e8f" xsi:nil="true"/>
-    <Number xmlns="5ec69448-d8a2-42ff-9be9-60116bcc6e8f" xsi:nil="true"/>
-  </documentManagement>
-</p:properties>
-</file>
-
-<file path=customXml/item3.xml><?xml version="1.0" encoding="utf-8"?>
-<?mso-contentType ?>
-<FormTemplates xmlns="http://schemas.microsoft.com/sharepoint/v3/contenttype/forms">
-  <Display>DocumentLibraryForm</Display>
-  <Edit>DocumentLibraryForm</Edit>
-  <New>DocumentLibraryForm</New>
-</FormTemplates>
-</file>
-
-<file path=customXml/item4.xml><?xml version="1.0" encoding="utf-8"?>
 <ct:contentTypeSchema xmlns:ct="http://schemas.microsoft.com/office/2006/metadata/contentType" xmlns:ma="http://schemas.microsoft.com/office/2006/metadata/properties/metaAttributes" ct:_="" ma:_="" ma:contentTypeName="Document" ma:contentTypeID="0x010100FE1665B3F48A3042B8F650AEB8377C4A" ma:contentTypeVersion="19" ma:contentTypeDescription="Create a new document." ma:contentTypeScope="" ma:versionID="b28cec35044305ac79a8b4088d9fe907">
   <xsd:schema xmlns:xsd="http://www.w3.org/2001/XMLSchema" xmlns:xs="http://www.w3.org/2001/XMLSchema" xmlns:p="http://schemas.microsoft.com/office/2006/metadata/properties" xmlns:ns2="5ec69448-d8a2-42ff-9be9-60116bcc6e8f" xmlns:ns3="67f16bc5-c4e0-4a74-8a5c-e83c6fc852f5" targetNamespace="http://schemas.microsoft.com/office/2006/metadata/properties" ma:root="true" ma:fieldsID="b7fc8310db0e7863c5a1848170daad9b" ns2:_="" ns3:_="">
     <xsd:import namespace="5ec69448-d8a2-42ff-9be9-60116bcc6e8f"/>
@@ -6502,33 +6369,35 @@
 </ct:contentTypeSchema>
 </file>
 
-<file path=customXml/itemProps1.xml><?xml version="1.0" encoding="utf-8"?>
-<ds:datastoreItem xmlns:ds="http://schemas.openxmlformats.org/officeDocument/2006/customXml" ds:itemID="{AF33A43D-DD84-4A74-AADA-C2C35E730581}">
-  <ds:schemaRefs>
-    <ds:schemaRef ds:uri="http://schemas.openxmlformats.org/officeDocument/2006/bibliography"/>
-  </ds:schemaRefs>
-</ds:datastoreItem>
+<file path=customXml/item2.xml><?xml version="1.0" encoding="utf-8"?>
+<?mso-contentType ?>
+<FormTemplates xmlns="http://schemas.microsoft.com/sharepoint/v3/contenttype/forms">
+  <Display>DocumentLibraryForm</Display>
+  <Edit>DocumentLibraryForm</Edit>
+  <New>DocumentLibraryForm</New>
+</FormTemplates>
 </file>
 
-<file path=customXml/itemProps2.xml><?xml version="1.0" encoding="utf-8"?>
-<ds:datastoreItem xmlns:ds="http://schemas.openxmlformats.org/officeDocument/2006/customXml" ds:itemID="{10848024-AF1B-4188-8B4C-B317AF2FB4A8}">
-  <ds:schemaRefs>
-    <ds:schemaRef ds:uri="http://schemas.microsoft.com/office/2006/metadata/properties"/>
-    <ds:schemaRef ds:uri="http://schemas.microsoft.com/office/infopath/2007/PartnerControls"/>
-    <ds:schemaRef ds:uri="5ec69448-d8a2-42ff-9be9-60116bcc6e8f"/>
-  </ds:schemaRefs>
-</ds:datastoreItem>
+<file path=customXml/item3.xml><?xml version="1.0" encoding="utf-8"?>
+<p:properties xmlns:p="http://schemas.microsoft.com/office/2006/metadata/properties" xmlns:xsi="http://www.w3.org/2001/XMLSchema-instance" xmlns:pc="http://schemas.microsoft.com/office/infopath/2007/PartnerControls">
+  <documentManagement>
+    <RevisionNo_x002e_ xmlns="5ec69448-d8a2-42ff-9be9-60116bcc6e8f" xsi:nil="true"/>
+    <lcf76f155ced4ddcb4097134ff3c332f xmlns="5ec69448-d8a2-42ff-9be9-60116bcc6e8f">
+      <Terms xmlns="http://schemas.microsoft.com/office/infopath/2007/PartnerControls"/>
+    </lcf76f155ced4ddcb4097134ff3c332f>
+    <DocumentStatus xmlns="5ec69448-d8a2-42ff-9be9-60116bcc6e8f" xsi:nil="true"/>
+    <Package xmlns="5ec69448-d8a2-42ff-9be9-60116bcc6e8f" xsi:nil="true"/>
+    <DocumentTitle xmlns="5ec69448-d8a2-42ff-9be9-60116bcc6e8f" xsi:nil="true"/>
+    <Number xmlns="5ec69448-d8a2-42ff-9be9-60116bcc6e8f" xsi:nil="true"/>
+  </documentManagement>
+</p:properties>
 </file>
 
-<file path=customXml/itemProps3.xml><?xml version="1.0" encoding="utf-8"?>
-<ds:datastoreItem xmlns:ds="http://schemas.openxmlformats.org/officeDocument/2006/customXml" ds:itemID="{D6D22FB6-D664-4EE3-9BA1-FDA43E150811}">
-  <ds:schemaRefs>
-    <ds:schemaRef ds:uri="http://schemas.microsoft.com/sharepoint/v3/contenttype/forms"/>
-  </ds:schemaRefs>
-</ds:datastoreItem>
+<file path=customXml/item4.xml><?xml version="1.0" encoding="utf-8"?>
+<b:Sources xmlns:b="http://schemas.openxmlformats.org/officeDocument/2006/bibliography" xmlns="http://schemas.openxmlformats.org/officeDocument/2006/bibliography" SelectedStyle="\APASixthEditionOfficeOnline.xsl" StyleName="APA" Version="6"/>
 </file>
 
-<file path=customXml/itemProps4.xml><?xml version="1.0" encoding="utf-8"?>
+<file path=customXml/itemProps1.xml><?xml version="1.0" encoding="utf-8"?>
 <ds:datastoreItem xmlns:ds="http://schemas.openxmlformats.org/officeDocument/2006/customXml" ds:itemID="{7B70D249-520A-4EED-BEFE-7EA052559083}">
   <ds:schemaRefs>
     <ds:schemaRef ds:uri="http://schemas.microsoft.com/office/2006/metadata/contentType"/>
@@ -6545,4 +6414,30 @@
     <ds:schemaRef ds:uri="http://schemas.microsoft.com/internal/obd"/>
   </ds:schemaRefs>
 </ds:datastoreItem>
+</file>
+
+<file path=customXml/itemProps2.xml><?xml version="1.0" encoding="utf-8"?>
+<ds:datastoreItem xmlns:ds="http://schemas.openxmlformats.org/officeDocument/2006/customXml" ds:itemID="{D6D22FB6-D664-4EE3-9BA1-FDA43E150811}">
+  <ds:schemaRefs>
+    <ds:schemaRef ds:uri="http://schemas.microsoft.com/sharepoint/v3/contenttype/forms"/>
+  </ds:schemaRefs>
+</ds:datastoreItem>
+</file>
+
+<file path=customXml/itemProps3.xml><?xml version="1.0" encoding="utf-8"?>
+<ds:datastoreItem xmlns:ds="http://schemas.openxmlformats.org/officeDocument/2006/customXml" ds:itemID="{10848024-AF1B-4188-8B4C-B317AF2FB4A8}">
+  <ds:schemaRefs>
+    <ds:schemaRef ds:uri="http://schemas.microsoft.com/office/2006/metadata/properties"/>
+    <ds:schemaRef ds:uri="http://schemas.microsoft.com/office/infopath/2007/PartnerControls"/>
+    <ds:schemaRef ds:uri="5ec69448-d8a2-42ff-9be9-60116bcc6e8f"/>
+  </ds:schemaRefs>
+</ds:datastoreItem>
+</file>
+
+<file path=customXml/itemProps4.xml><?xml version="1.0" encoding="utf-8"?>
+<ds:datastoreItem xmlns:ds="http://schemas.openxmlformats.org/officeDocument/2006/customXml" ds:itemID="{AF33A43D-DD84-4A74-AADA-C2C35E730581}">
+  <ds:schemaRefs>
+    <ds:schemaRef ds:uri="http://schemas.openxmlformats.org/officeDocument/2006/bibliography"/>
+  </ds:schemaRefs>
+</ds:datastoreItem>
 </file>
</xml_diff>